<commit_message>
Audit fixes: year labels, Galilee 2 route slide, Jaffa product lines, IMTM mega-event, Haifa visitor sectors, Golan active-leisure conditions; worksheets regenerated
Co-Authored-By: Claude Opus 5.5 <noreply@anthropic.com>
Claude-Session: https://claude.ai/code/session_01AhWt76aQYnK2GHBZTwEpVE
</commit_message>
<xml_diff>
--- a/tayarut/coastal/02/worksheet.docx
+++ b/tayarut/coastal/02/worksheet.docx
@@ -679,197 +679,7 @@
                 <w:szCs w:val="21"/>
                 <w:rtl/>
               </w:rPr>
-              <w:t>המושבה הגרמנית:</w:t>
-            </w:r>
-          </w:p>
-        </w:tc>
-        <w:tc>
-          <w:tcPr>
-            <w:tcW w:type="dxa" w:w="7143"/>
-          </w:tcPr>
-          <w:p>
-            <w:pPr>
-              <w:bidi/>
-            </w:pPr>
-          </w:p>
-        </w:tc>
-      </w:tr>
-      <w:tr>
-        <w:trPr>
-          <w:cantSplit/>
-          <w:trHeight w:val="624"/>
-        </w:trPr>
-        <w:tc>
-          <w:tcPr>
-            <w:tcW w:type="dxa" w:w="2721"/>
-          </w:tcPr>
-          <w:p>
-            <w:pPr>
-              <w:bidi/>
-            </w:pPr>
-            <w:r>
-              <w:rPr>
-                <w:rFonts w:ascii="Arial" w:hAnsi="Arial" w:cs="Arial" w:eastAsia="Arial"/>
-                <w:b/>
-                <w:bCs/>
-                <w:i w:val="0"/>
-                <w:sz w:val="21"/>
-                <w:szCs w:val="21"/>
-                <w:rtl/>
-              </w:rPr>
-              <w:t>הרכבל</w:t>
-            </w:r>
-          </w:p>
-        </w:tc>
-        <w:tc>
-          <w:tcPr>
-            <w:tcW w:type="dxa" w:w="7143"/>
-          </w:tcPr>
-          <w:p>
-            <w:pPr>
-              <w:bidi/>
-            </w:pPr>
-          </w:p>
-        </w:tc>
-      </w:tr>
-      <w:tr>
-        <w:trPr>
-          <w:cantSplit/>
-          <w:trHeight w:val="624"/>
-        </w:trPr>
-        <w:tc>
-          <w:tcPr>
-            <w:tcW w:type="dxa" w:w="2721"/>
-          </w:tcPr>
-          <w:p>
-            <w:pPr>
-              <w:bidi/>
-            </w:pPr>
-            <w:r>
-              <w:rPr>
-                <w:rFonts w:ascii="Arial" w:hAnsi="Arial" w:cs="Arial" w:eastAsia="Arial"/>
-                <w:b/>
-                <w:bCs/>
-                <w:i w:val="0"/>
-                <w:sz w:val="21"/>
-                <w:szCs w:val="21"/>
-                <w:rtl/>
-              </w:rPr>
-              <w:t>הכרמלית</w:t>
-            </w:r>
-          </w:p>
-        </w:tc>
-        <w:tc>
-          <w:tcPr>
-            <w:tcW w:type="dxa" w:w="7143"/>
-          </w:tcPr>
-          <w:p>
-            <w:pPr>
-              <w:bidi/>
-            </w:pPr>
-          </w:p>
-        </w:tc>
-      </w:tr>
-      <w:tr>
-        <w:trPr>
-          <w:cantSplit/>
-          <w:trHeight w:val="624"/>
-        </w:trPr>
-        <w:tc>
-          <w:tcPr>
-            <w:tcW w:type="dxa" w:w="2721"/>
-          </w:tcPr>
-          <w:p>
-            <w:pPr>
-              <w:bidi/>
-            </w:pPr>
-            <w:r>
-              <w:rPr>
-                <w:rFonts w:ascii="Arial" w:hAnsi="Arial" w:cs="Arial" w:eastAsia="Arial"/>
-                <w:b/>
-                <w:bCs/>
-                <w:i w:val="0"/>
-                <w:sz w:val="21"/>
-                <w:szCs w:val="21"/>
-                <w:rtl/>
-              </w:rPr>
-              <w:t>מוזיאונים:</w:t>
-            </w:r>
-          </w:p>
-        </w:tc>
-        <w:tc>
-          <w:tcPr>
-            <w:tcW w:type="dxa" w:w="7143"/>
-          </w:tcPr>
-          <w:p>
-            <w:pPr>
-              <w:bidi/>
-            </w:pPr>
-          </w:p>
-        </w:tc>
-      </w:tr>
-      <w:tr>
-        <w:trPr>
-          <w:cantSplit/>
-          <w:trHeight w:val="624"/>
-        </w:trPr>
-        <w:tc>
-          <w:tcPr>
-            <w:tcW w:type="dxa" w:w="2721"/>
-          </w:tcPr>
-          <w:p>
-            <w:pPr>
-              <w:bidi/>
-            </w:pPr>
-            <w:r>
-              <w:rPr>
-                <w:rFonts w:ascii="Arial" w:hAnsi="Arial" w:cs="Arial" w:eastAsia="Arial"/>
-                <w:b/>
-                <w:bCs/>
-                <w:i w:val="0"/>
-                <w:sz w:val="21"/>
-                <w:szCs w:val="21"/>
-                <w:rtl/>
-              </w:rPr>
-              <w:t>עסקים וכנסים:</w:t>
-            </w:r>
-          </w:p>
-        </w:tc>
-        <w:tc>
-          <w:tcPr>
-            <w:tcW w:type="dxa" w:w="7143"/>
-          </w:tcPr>
-          <w:p>
-            <w:pPr>
-              <w:bidi/>
-            </w:pPr>
-          </w:p>
-        </w:tc>
-      </w:tr>
-      <w:tr>
-        <w:trPr>
-          <w:cantSplit/>
-          <w:trHeight w:val="624"/>
-        </w:trPr>
-        <w:tc>
-          <w:tcPr>
-            <w:tcW w:type="dxa" w:w="2721"/>
-          </w:tcPr>
-          <w:p>
-            <w:pPr>
-              <w:bidi/>
-            </w:pPr>
-            <w:r>
-              <w:rPr>
-                <w:rFonts w:ascii="Arial" w:hAnsi="Arial" w:cs="Arial" w:eastAsia="Arial"/>
-                <w:b/>
-                <w:bCs/>
-                <w:i w:val="0"/>
-                <w:sz w:val="21"/>
-                <w:szCs w:val="21"/>
-                <w:rtl/>
-              </w:rPr>
-              <w:t>מרכז הקונגרסים בחיפה</w:t>
+              <w:t>מי מגיע לאן</w:t>
             </w:r>
           </w:p>
         </w:tc>

</xml_diff>

<commit_message>
Marketing concepts slides: product mix, regional tourism, equilibrium, product life cycle, glamping
Co-Authored-By: Claude Opus 5.5 <noreply@anthropic.com>
Claude-Session: https://claude.ai/code/session_01AhWt76aQYnK2GHBZTwEpVE
</commit_message>
<xml_diff>
--- a/tayarut/coastal/02/worksheet.docx
+++ b/tayarut/coastal/02/worksheet.docx
@@ -1704,7 +1704,155 @@
           <w:szCs w:val="18"/>
           <w:rtl/>
         </w:rPr>
-        <w:t xml:space="preserve">שקף 10  </w:t>
+        <w:t xml:space="preserve">שקף 9  </w:t>
+      </w:r>
+      <w:r>
+        <w:rPr>
+          <w:rFonts w:ascii="Arial" w:hAnsi="Arial" w:cs="Arial" w:eastAsia="Arial"/>
+          <w:b w:val="0"/>
+          <w:i w:val="0"/>
+          <w:color w:val="555555"/>
+          <w:sz w:val="18"/>
+          <w:szCs w:val="18"/>
+          <w:rtl/>
+        </w:rPr>
+        <w:t xml:space="preserve">מושגי שיווק  </w:t>
+      </w:r>
+    </w:p>
+    <w:p>
+      <w:pPr>
+        <w:keepNext/>
+        <w:bidi/>
+        <w:spacing w:before="0" w:after="80"/>
+      </w:pPr>
+      <w:r>
+        <w:rPr>
+          <w:rFonts w:ascii="Arial" w:hAnsi="Arial" w:cs="Arial" w:eastAsia="Arial"/>
+          <w:b/>
+          <w:bCs/>
+          <w:i w:val="0"/>
+          <w:sz w:val="28"/>
+          <w:szCs w:val="28"/>
+          <w:rtl/>
+        </w:rPr>
+        <w:t>תיירות אזורית בחוף הכרמל</w:t>
+      </w:r>
+    </w:p>
+    <w:tbl>
+      <w:tblPr>
+        <w:tblStyle w:val="TableGrid"/>
+        <w:bidiVisual/>
+        <w:tblW w:type="auto" w:w="0"/>
+        <w:tblLayout w:type="fixed"/>
+        <w:tblLayout w:type="fixed"/>
+        <w:tblLook w:firstColumn="1" w:firstRow="1" w:lastColumn="0" w:lastRow="0" w:noHBand="0" w:noVBand="1" w:val="04A0"/>
+      </w:tblPr>
+      <w:tblGrid>
+        <w:gridCol w:w="2721"/>
+        <w:gridCol w:w="7143"/>
+      </w:tblGrid>
+      <w:tr>
+        <w:trPr>
+          <w:cantSplit/>
+          <w:tblHeader/>
+        </w:trPr>
+        <w:tc>
+          <w:tcPr>
+            <w:tcW w:type="dxa" w:w="2721"/>
+            <w:shd w:val="clear" w:fill="E6E6E6"/>
+          </w:tcPr>
+          <w:p>
+            <w:pPr>
+              <w:bidi/>
+            </w:pPr>
+          </w:p>
+        </w:tc>
+        <w:tc>
+          <w:tcPr>
+            <w:tcW w:type="dxa" w:w="7143"/>
+            <w:shd w:val="clear" w:fill="E6E6E6"/>
+          </w:tcPr>
+          <w:p>
+            <w:pPr>
+              <w:bidi/>
+            </w:pPr>
+            <w:r>
+              <w:rPr>
+                <w:rFonts w:ascii="Arial" w:hAnsi="Arial" w:cs="Arial" w:eastAsia="Arial"/>
+                <w:b/>
+                <w:bCs/>
+                <w:i w:val="0"/>
+                <w:sz w:val="21"/>
+                <w:szCs w:val="21"/>
+                <w:rtl/>
+              </w:rPr>
+              <w:t>מה חשוב לזכור</w:t>
+            </w:r>
+          </w:p>
+        </w:tc>
+      </w:tr>
+      <w:tr>
+        <w:trPr>
+          <w:cantSplit/>
+          <w:trHeight w:val="624"/>
+        </w:trPr>
+        <w:tc>
+          <w:tcPr>
+            <w:tcW w:type="dxa" w:w="2721"/>
+          </w:tcPr>
+          <w:p>
+            <w:pPr>
+              <w:bidi/>
+            </w:pPr>
+            <w:r>
+              <w:rPr>
+                <w:rFonts w:ascii="Arial" w:hAnsi="Arial" w:cs="Arial" w:eastAsia="Arial"/>
+                <w:b/>
+                <w:bCs/>
+                <w:i w:val="0"/>
+                <w:sz w:val="21"/>
+                <w:szCs w:val="21"/>
+                <w:rtl/>
+              </w:rPr>
+              <w:t>תיירות אזורית</w:t>
+            </w:r>
+          </w:p>
+        </w:tc>
+        <w:tc>
+          <w:tcPr>
+            <w:tcW w:type="dxa" w:w="7143"/>
+          </w:tcPr>
+          <w:p>
+            <w:pPr>
+              <w:bidi/>
+            </w:pPr>
+          </w:p>
+        </w:tc>
+      </w:tr>
+    </w:tbl>
+    <w:p>
+      <w:pPr>
+        <w:bidi/>
+        <w:spacing w:before="0" w:after="80"/>
+      </w:pPr>
+    </w:p>
+    <w:p>
+      <w:pPr>
+        <w:keepNext/>
+        <w:bidi/>
+        <w:spacing w:before="200" w:after="40"/>
+      </w:pPr>
+      <w:r>
+        <w:rPr>
+          <w:rFonts w:ascii="Arial" w:hAnsi="Arial" w:cs="Arial" w:eastAsia="Arial"/>
+          <w:b w:val="0"/>
+          <w:i w:val="0"/>
+          <w:color w:val="555555"/>
+          <w:sz w:val="18"/>
+          <w:szCs w:val="18"/>
+          <w:rtl/>
+        </w:rPr>
+        <w:t xml:space="preserve">שקף 11  </w:t>
       </w:r>
       <w:r>
         <w:rPr>
@@ -2080,7 +2228,7 @@
           <w:szCs w:val="18"/>
           <w:rtl/>
         </w:rPr>
-        <w:t xml:space="preserve">שקף 13  </w:t>
+        <w:t xml:space="preserve">שקף 14  </w:t>
       </w:r>
     </w:p>
     <w:p>

</xml_diff>